<commit_message>
Improve CECL demo intake coverage and deterministic batch fill
</commit_message>
<xml_diff>
--- a/Demo Documents/Vendor_Data_Requirements_Mapping_ETL_Specification.docx
+++ b/Demo Documents/Vendor_Data_Requirements_Mapping_ETL_Specification.docx
@@ -607,6 +607,78 @@
       </w:r>
     </w:p>
     <w:p>
+      <w:pPr>
+        <w:pStyle w:val="Heading2"/>
+      </w:pPr>
+      <w:r>
+        <w:t>1.3 Data History Requirements and Expected Volumes</w:t>
+      </w:r>
+    </w:p>
+    <w:p>
+      <w:pPr>
+        <w:pStyle w:val="BodyText"/>
+      </w:pPr>
+      <w:r>
+        <w:t xml:space="preserve">The CECL Suite requires a minimum of 24 months of consecutive month-end snapshot history (ACCOUNT_SNAPSHOT) for each product in scope to support back-testing and calibration validation. For initial implementation, Northstar recommends delivering a full historical load of 5 to 10 years of snapshot data where available, covering at least one credit stress period (e.g., 2008–2010 or 2020 COVID period) to support robust calibration diagnostics and out-of-time testing. The historical load is a one-time exercise; ongoing production loads are monthly. Transactional tables (TRANSACTION, CHARGEOFF, RECOVERY) should be loaded for the same historical period to support balance roll reconciliation and loss history analysis. Collateral and score tables may be loaded on a best-available basis for historical periods.</w:t>
+      </w:r>
+    </w:p>
+    <w:p>
+      <w:pPr>
+        <w:pStyle w:val="BodyText"/>
+      </w:pPr>
+      <w:r>
+        <w:t xml:space="preserve">Expected data volumes vary by portfolio size and product mix. For reference, a typical mid-size regional bank client with 150,000 to 500,000 active accounts can expect: ACCOUNT_SNAPSHOT — approximately 150,000 to 500,000 rows per monthly load (one row per active account); TRANSACTION — 500,000 to 2,000,000 rows per monthly load depending on transaction frequency; CHARGEOFF and RECOVERY — typically 500 to 5,000 rows per monthly load for most retail portfolios; COLLATERAL — a one-time or periodic bulk load of 50,000 to 200,000 records, updated as new valuations are available; SCORE — one row per customer per score observation, refreshed monthly or quarterly depending on bureau pull frequency. Northstar’s landing zone supports file sizes up to 5 GB per table per delivery; larger files should be split by portfolio_code or product_code with Northstar prior arrangement.</w:t>
+      </w:r>
+    </w:p>
+    <w:p>
+      <w:pPr>
+        <w:pStyle w:val="Heading2"/>
+      </w:pPr>
+      <w:r>
+        <w:t>1.4 Extraction Method: Automated vs. Manual</w:t>
+      </w:r>
+    </w:p>
+    <w:p>
+      <w:pPr>
+        <w:pStyle w:val="BodyText"/>
+      </w:pPr>
+      <w:r>
+        <w:t xml:space="preserve">Northstar strongly recommends that the client implement automated, scheduled extraction processes for all production data loads. Automated extraction reduces the risk of human error, supports reproducibility, and enables timely delivery within the T+3 window. The recommended automation pattern is: (i) a scheduled job (e.g., SQL Agent, Airflow, or equivalent) fires at month-end close; (ii) the job executes extraction queries against the system of record for each required table; (iii) output files are generated in the required format (pipe-delimited or CSV, UTF-8), PGP-encrypted, and staged in the SFTP landing zone; (iv) a delivery manifest or checksum file is placed alongside the data files; and (v) the Northstar QC process is triggered automatically upon file arrival. The client’s data engineering or IT team is responsible for designing, implementing, testing, and maintaining the automated pipeline. Northstar provides sample SQL pseudocode (see Appendix D) and mapping workbook templates to accelerate this build.</w:t>
+      </w:r>
+    </w:p>
+    <w:p>
+      <w:pPr>
+        <w:pStyle w:val="BodyText"/>
+      </w:pPr>
+      <w:r>
+        <w:t xml:space="preserve">Where automated extraction is not yet implemented for certain tables (e.g., collateral valuations from a manual appraisal system), a controlled manual process is acceptable during the implementation phase provided that: (a) the manual extraction steps are documented in a written operating procedure reviewed by the model owner; (b) a second-reviewer sign-off is applied before file delivery; and (c) a remediation plan to automate the process is documented and tracked. Manual extractions must not be used for core snapshot, transaction, charge-off, or recovery tables in steady-state production without explicit exception approval from model risk management. All production extractions — automated or manual — must be logged with extraction date, as_of_date, row count, and operator identity as part of the monthly data certification package (see Section 9.4).</w:t>
+      </w:r>
+    </w:p>
+    <w:p>
+      <w:pPr>
+        <w:pStyle w:val="Heading2"/>
+      </w:pPr>
+      <w:r>
+        <w:t>1.5 Consortium and Proxy Data</w:t>
+      </w:r>
+    </w:p>
+    <w:p>
+      <w:pPr>
+        <w:pStyle w:val="BodyText"/>
+      </w:pPr>
+      <w:r>
+        <w:t xml:space="preserve">The Northstar CECL Suite model parameters are calibrated using a consortium development dataset drawn from contributing client institutions, supplemented by publicly available macroeconomic series. Clients do not directly access or receive consortium data; however, model parameters embedded in the CECL Suite configuration reflect this multi-client development history. This is relevant for client governance teams because: (i) the applicability of consortium-derived parameters to the client’s specific portfolio must be assessed (see Appendix E in the Methodology and Model Development Report, Document NA-CECL-MDR-4.2); and (ii) where client-specific loss history is available and sufficient, Northstar performs local recalibration using client data in preference to consortium averages.</w:t>
+      </w:r>
+    </w:p>
+    <w:p>
+      <w:pPr>
+        <w:pStyle w:val="BodyText"/>
+      </w:pPr>
+      <w:r>
+        <w:t xml:space="preserve">Proxy data is used in two circumstances within the ETL context: (i) where the client cannot provide an effective interest rate (EIR) at the instrument level, a product-level proxy rate table (CONFIG_LOOKUP) may be substituted (see Section 7.5); and (ii) where collateral valuations are unavailable or stale, conservative index-based haircuts may be applied using published price indices (e.g., Manheim for auto, FHFA HPI for real estate) as proxies for current market value. All proxy substitutions must be documented in the monthly data certification package and flagged in the model run metadata so that validators and auditors can identify instruments where proxy assumptions are operative.</w:t>
+      </w:r>
+    </w:p>
+    <w:p>
       <w:r>
         <w:br w:type="page"/>
       </w:r>
@@ -8885,6 +8957,30 @@
       </w:tr>
     </w:tbl>
     <w:p>
+      <w:pPr>
+        <w:pStyle w:val="Heading2"/>
+      </w:pPr>
+      <w:r>
+        <w:t>9.4 Data Certification and Sign-Off Process</w:t>
+      </w:r>
+    </w:p>
+    <w:p>
+      <w:pPr>
+        <w:pStyle w:val="BodyText"/>
+      </w:pPr>
+      <w:r>
+        <w:t xml:space="preserve">Northstar requires that each production data load be accompanied by a signed data certification prior to model run sign-off. The data certification is a documented attestation by a designated client data owner (or delegate) affirming that: (i) the data files delivered for the applicable as_of_date were extracted from authoritative source systems using the approved extraction process; (ii) record counts and control totals have been reconciled to source system reports within the established tolerances (Section 9.3); (iii) all Critical and High QC findings identified in the Northstar pre-run QC report have been resolved or formally excepted with documented rationale; and (iv) no known data quality issues exist that would materially affect model outputs without being reflected in the run metadata or overlays. The certification covers all tables delivered for the applicable as_of_date and is typically completed by the data engineering lead or finance controllership designee with model risk management visibility.</w:t>
+      </w:r>
+    </w:p>
+    <w:p>
+      <w:pPr>
+        <w:pStyle w:val="BodyText"/>
+      </w:pPr>
+      <w:r>
+        <w:t xml:space="preserve">The data certification package should be retained as a permanent record alongside the model run artifacts. Northstar recommends a standardized monthly Data Certification Memo template that captures: as_of_date; list of tables delivered with row counts and load timestamps; reconciliation summary (balance, charge-off, recovery); QC exception log (rule ID, description, severity, resolution); names and signatures of certifying parties; and date of certification. The memo is signed by the data owner and countersigned by the model owner before the model run results are released for use in financial reporting. Where the client operates under a formal model governance committee structure, the certification memo is submitted as a supporting document at the quarterly ACL Committee meeting.</w:t>
+      </w:r>
+    </w:p>
+    <w:p>
       <w:r>
         <w:br w:type="page"/>
       </w:r>
@@ -9063,6 +9159,54 @@
       </w:r>
     </w:p>
     <w:p>
+      <w:pPr>
+        <w:pStyle w:val="Heading2"/>
+      </w:pPr>
+      <w:r>
+        <w:t>11.2 User Acceptance Testing (UAT) and Parallel Run Requirements</w:t>
+      </w:r>
+    </w:p>
+    <w:p>
+      <w:pPr>
+        <w:pStyle w:val="BodyText"/>
+      </w:pPr>
+      <w:r>
+        <w:t xml:space="preserve">Prior to go-live, Northstar requires that the client complete a formal User Acceptance Testing (UAT) phase and, where applicable, a parallel run against the prior process or model. UAT is conducted in the Northstar non-production (UAT) environment using client data and is intended to verify that: (i) all required tables are delivered correctly and pass QC rules consistently; (ii) field mappings produce economically sensible outputs at the segment and portfolio level; (iii) reconciliations close within tolerance; (iv) model outputs (ECL, PD, LGD, EAD) are directionally consistent with expectations based on portfolio characteristics; and (v) the end-to-end process — from data extraction through model output delivery — can be executed within the required timeline (T+3 delivery, with model results available to finance by T+5 or as agreed).</w:t>
+      </w:r>
+    </w:p>
+    <w:p>
+      <w:pPr>
+        <w:pStyle w:val="BodyText"/>
+      </w:pPr>
+      <w:r>
+        <w:t xml:space="preserve">UAT must cover a minimum of three consecutive month-end periods using actual client production data (masked if required). For each UAT period, the client signs a UAT acceptance record confirming that QC results, reconciliations, and model outputs have been reviewed and found acceptable. Outstanding defects or questions are documented in a UAT findings log maintained jointly by Northstar and the client implementation team. All Critical and High findings must be resolved before the client proceeds to production sign-off.</w:t>
+      </w:r>
+    </w:p>
+    <w:p>
+      <w:pPr>
+        <w:pStyle w:val="BodyText"/>
+      </w:pPr>
+      <w:r>
+        <w:t xml:space="preserve">For clients transitioning from a prior CECL model or estimation approach, Northstar recommends a parallel run of at least two reporting periods (quarters) during which both the legacy approach and the Northstar CECL Suite are operated simultaneously. The parallel run serves to: (a) identify unexplained differences in ECL estimates between the two approaches; (b) provide the client’s model risk management and validation team with a basis for evaluating model performance prior to formal validation; and (c) give the ACL/ALLL Committee visibility into the expected financial impact of the model transition before go-live. Significant unexplained differences (typically defined as greater than 10% of total reserve at portfolio level) should be investigated and documented before relying on Northstar outputs for financial reporting. The parallel run results, including a comparison summary and explanations of key differences, are retained as part of the model implementation documentation and provided to the independent model validator.</w:t>
+      </w:r>
+    </w:p>
+    <w:p>
+      <w:pPr>
+        <w:pStyle w:val="Heading2"/>
+      </w:pPr>
+      <w:r>
+        <w:t>11.3 Production Go-Live Sign-Off</w:t>
+      </w:r>
+    </w:p>
+    <w:p>
+      <w:pPr>
+        <w:pStyle w:val="BodyText"/>
+      </w:pPr>
+      <w:r>
+        <w:t xml:space="preserve">Production go-live requires a formal sign-off from the model owner and data owner confirming completion of UAT (and parallel run where applicable), resolution of all Critical and High findings, and readiness of the operating procedures and data certification process. The go-live sign-off memo is archived as part of the model implementation record. Northstar countersigns the go-live memo upon confirmation that the production environment is configured correctly and that an implementation certification letter has been issued (see Appendix E). Post-go-live, the first two production cycles are monitored by Northstar implementation support with a heightened review of QC output and reconciliation results before transitioning to standard steady-state support.</w:t>
+      </w:r>
+    </w:p>
+    <w:p>
       <w:r>
         <w:br w:type="page"/>
       </w:r>
@@ -9241,6 +9385,224 @@
       </w:pPr>
       <w:r>
         <w:t>Execute production dry-run and sign-off for go-live.</w:t>
+      </w:r>
+    </w:p>
+    <w:p>
+      <w:r>
+        <w:br w:type="page"/>
+      </w:r>
+    </w:p>
+    <w:p>
+      <w:pPr>
+        <w:pStyle w:val="Heading1"/>
+      </w:pPr>
+      <w:r>
+        <w:t>Appendix D: Step-by-Step Monthly Operating Procedures</w:t>
+      </w:r>
+    </w:p>
+    <w:p>
+      <w:pPr>
+        <w:pStyle w:val="BodyText"/>
+      </w:pPr>
+      <w:r>
+        <w:t xml:space="preserve">The following procedure defines the standard steps for a monthly production data load and model run cycle. This document should be maintained as a controlled operating procedure, reviewed annually, and updated whenever the extraction process, system of record, or delivery method changes. A completed and signed copy of this checklist should be retained for each reporting period as part of the data certification package.</w:t>
+      </w:r>
+    </w:p>
+    <w:p>
+      <w:pPr>
+        <w:pStyle w:val="Heading2"/>
+      </w:pPr>
+      <w:r>
+        <w:t>D.1 Pre-Extraction (T+0 to T+1, Month-End Close)</w:t>
+      </w:r>
+    </w:p>
+    <w:p>
+      <w:pPr>
+        <w:pStyle w:val="ListNumber"/>
+      </w:pPr>
+      <w:r>
+        <w:t xml:space="preserve">Confirm month-end close date and as_of_date with Finance/Controllership. Ensure the as_of_date is consistent with the GL close and the prior month’s as_of_date + 1 month.</w:t>
+      </w:r>
+    </w:p>
+    <w:p>
+      <w:pPr>
+        <w:pStyle w:val="ListNumber"/>
+      </w:pPr>
+      <w:r>
+        <w:t>Confirm that all source systems are closed and balances are final for the reporting period. Do not extract from systems that have not yet completed end-of-period processing.</w:t>
+      </w:r>
+    </w:p>
+    <w:p>
+      <w:pPr>
+        <w:pStyle w:val="ListNumber"/>
+      </w:pPr>
+      <w:r>
+        <w:t>Verify that the macro scenario file for the current reporting period has been approved by the appropriate committee and is staged in the macro scenario directory. Confirm the scenario_set identifier matches the approved package.</w:t>
+      </w:r>
+    </w:p>
+    <w:p>
+      <w:pPr>
+        <w:pStyle w:val="Heading2"/>
+      </w:pPr>
+      <w:r>
+        <w:t>D.2 Data Extraction (T+1 to T+2)</w:t>
+      </w:r>
+    </w:p>
+    <w:p>
+      <w:pPr>
+        <w:pStyle w:val="ListNumber"/>
+      </w:pPr>
+      <w:r>
+        <w:t>Execute the scheduled extraction jobs for each required table (ACCOUNT_MASTER, ACCOUNT_SNAPSHOT, TRANSACTION, CHARGEOFF, RECOVERY, COLLATERAL, SCORE, GL_CONTROL_TOTALS) as documented in the client mapping workbook. Confirm each job completes without error.</w:t>
+      </w:r>
+    </w:p>
+    <w:p>
+      <w:pPr>
+        <w:pStyle w:val="ListNumber"/>
+      </w:pPr>
+      <w:r>
+        <w:t>Record the row count for each output file and compare to the prior month. Investigate any row count change greater than 10% (upward or downward) before proceeding. Document the explanation (e.g., portfolio growth, sold accounts, system migration).</w:t>
+      </w:r>
+    </w:p>
+    <w:p>
+      <w:pPr>
+        <w:pStyle w:val="ListNumber"/>
+      </w:pPr>
+      <w:r>
+        <w:t>Run the internal pre-delivery reconciliation: tie ACCOUNT_SNAPSHOT total current_balance to the core system month-end balance report by product/portfolio. Confirm charge-offs and recoveries tie to GL. Document differences within tolerance; escalate and hold delivery if outside tolerance.</w:t>
+      </w:r>
+    </w:p>
+    <w:p>
+      <w:pPr>
+        <w:pStyle w:val="ListNumber"/>
+      </w:pPr>
+      <w:r>
+        <w:t xml:space="preserve">Apply PGP encryption to each output file using the current Northstar public key. Generate SHA-256 checksums. Name files per the convention in Section 4.2: &lt;client_code&gt;_&lt;table_name&gt;_&lt;as_of_date&gt;_&lt;load_timestamp&gt;.csv.pgp.</w:t>
+      </w:r>
+    </w:p>
+    <w:p>
+      <w:pPr>
+        <w:pStyle w:val="Heading2"/>
+      </w:pPr>
+      <w:r>
+        <w:t>D.3 Delivery and QC Review (T+2 to T+3)</w:t>
+      </w:r>
+    </w:p>
+    <w:p>
+      <w:pPr>
+        <w:pStyle w:val="ListNumber"/>
+      </w:pPr>
+      <w:r>
+        <w:t>Transfer all encrypted files and checksum files to the Northstar SFTP landing zone. Confirm transfer completion and receipt acknowledgment from Northstar (automated notification or manual confirmation from Northstar data onboarding team).</w:t>
+      </w:r>
+    </w:p>
+    <w:p>
+      <w:pPr>
+        <w:pStyle w:val="ListNumber"/>
+      </w:pPr>
+      <w:r>
+        <w:t>Await the Northstar pre-run QC report (typically delivered within 4 business hours of file receipt). Review all Critical and High findings. Remediate and re-deliver affected tables as needed. Document the resolution for each finding in the QC exception log.</w:t>
+      </w:r>
+    </w:p>
+    <w:p>
+      <w:pPr>
+        <w:pStyle w:val="ListNumber"/>
+      </w:pPr>
+      <w:r>
+        <w:t>Data owner signs the Data Certification Memo confirming that all deliveries are complete, reconciliations are within tolerance, and QC findings are resolved or excepted. Memo is countersigned by the model owner.</w:t>
+      </w:r>
+    </w:p>
+    <w:p>
+      <w:pPr>
+        <w:pStyle w:val="Heading2"/>
+      </w:pPr>
+      <w:r>
+        <w:t>D.4 Model Run and Output Review (T+3 to T+5)</w:t>
+      </w:r>
+    </w:p>
+    <w:p>
+      <w:pPr>
+        <w:pStyle w:val="ListNumber"/>
+      </w:pPr>
+      <w:r>
+        <w:t>Confirm that Northstar has initiated the model run using the certified data and approved scenario set. Verify that the run_id and scenario_set_id in the run metadata match the expected values.</w:t>
+      </w:r>
+    </w:p>
+    <w:p>
+      <w:pPr>
+        <w:pStyle w:val="ListNumber"/>
+      </w:pPr>
+      <w:r>
+        <w:t>Review model outputs at the portfolio and segment level: total ECL, ECL coverage ratio, period-over-period change, and segment-level contribution. Investigate any segment with a change in ECL greater than 15% without a corresponding change in portfolio mix, macro path, or overlay to explain the movement.</w:t>
+      </w:r>
+    </w:p>
+    <w:p>
+      <w:pPr>
+        <w:pStyle w:val="ListNumber"/>
+      </w:pPr>
+      <w:r>
+        <w:t>Document and obtain approval for any management overlays applied. Record overlay metadata in the model run configuration before final results are released.</w:t>
+      </w:r>
+    </w:p>
+    <w:p>
+      <w:pPr>
+        <w:pStyle w:val="ListNumber"/>
+      </w:pPr>
+      <w:r>
+        <w:t>Model owner signs the run sign-off memo confirming that outputs have been reviewed and are approved for use in financial reporting. The signed memo, data certification, QC exception log, and run metadata are archived together as the complete run package for the period.</w:t>
+      </w:r>
+    </w:p>
+    <w:p>
+      <w:r>
+        <w:br w:type="page"/>
+      </w:r>
+    </w:p>
+    <w:p>
+      <w:pPr>
+        <w:pStyle w:val="Heading1"/>
+      </w:pPr>
+      <w:r>
+        <w:t>Appendix E: SOC Reports and Implementation Certification</w:t>
+      </w:r>
+    </w:p>
+    <w:p>
+      <w:pPr>
+        <w:pStyle w:val="BodyText"/>
+      </w:pPr>
+      <w:r>
+        <w:t xml:space="preserve">Northstar Analytics undergoes annual independent examinations to support client reliance on Northstar’s controls relevant to data handling, processing, and delivery. The following reports are available to clients and their auditors upon execution of a non-disclosure agreement with Northstar Client Services (dataonboarding@northstaranalytics.example).</w:t>
+      </w:r>
+    </w:p>
+    <w:p>
+      <w:pPr>
+        <w:pStyle w:val="BodyText"/>
+      </w:pPr>
+      <w:r>
+        <w:t xml:space="preserve">SOC 1 Type II Report (SSAE 18): Covers controls at Northstar relevant to client financial reporting, including the CECL Suite data ingestion pipeline, QC rule execution, model run controls, and output delivery. Report period: January 1 – December 31, 2025. Issued by an independent registered public accounting firm. No material control exceptions noted in the 2025 report. Bridge letters covering the gap period after December 31, 2025 are available upon request.</w:t>
+      </w:r>
+    </w:p>
+    <w:p>
+      <w:pPr>
+        <w:pStyle w:val="BodyText"/>
+      </w:pPr>
+      <w:r>
+        <w:t xml:space="preserve">SOC 2 Type II Report (Trust Services Criteria — Security, Availability, Confidentiality): Covers the Northstar hosted platform environment including data transmission controls (SFTP, API), encryption at rest and in transit, access management, and incident response. Report period: January 1 – December 31, 2025. No material exceptions noted. Available under NDA.</w:t>
+      </w:r>
+    </w:p>
+    <w:p>
+      <w:pPr>
+        <w:pStyle w:val="BodyText"/>
+      </w:pPr>
+      <w:r>
+        <w:t xml:space="preserve">Implementation Certification Letter: Northstar issues an Implementation Certification Letter confirming that the CECL Suite data integration has been configured and tested in accordance with this specification for the named client and named schema version. For Sample Regional Bank, the current certification covers schema version 1.2 (this document) and CECL Suite v4.2. The certification is updated with each major schema or model version release. Document reference: NA-SRB-CERT-4.2.</w:t>
+      </w:r>
+    </w:p>
+    <w:p>
+      <w:pPr>
+        <w:pStyle w:val="BodyText"/>
+      </w:pPr>
+      <w:r>
+        <w:t xml:space="preserve">Clients are responsible for reviewing applicable SOC reports and assessing whether any noted exceptions or complementary user entity controls (CUECs) affect their reliance on Northstar’s processing. CUECs identified in the SOC 1 report that apply to this ETL specification include: (a) client responsibility for reconciling delivered data to source systems prior to delivery; (b) client responsibility for maintaining PGP key management and SFTP credential security on the client side; and (c) client responsibility for reviewing and approving QC exception dispositions before authorizing the model run. These CUECs are addressed by the data certification process defined in Section 9.4 and the operating procedures in Appendix D.</w:t>
       </w:r>
     </w:p>
     <w:sectPr>

</xml_diff>